<commit_message>
Fix German template: keep English ATS section headers, drop injected tokens
The German template failed two ATS checks because the earlier version
(a) translated the section headers (ATS keys on literal EXPERIENCE/EDUCATION/
SKILLS) and (b) rewrote placeholder bullets with tool names (PHPUnit/PHPDoc)
that tripped the "flattened blob" heuristic. Now: section headers stay English
(structural keys), only the prose is faithfully translated to German, dates are
MM.YYYY, name/contact German placeholder. Base is unchanged (ATS-fixed EN
template: left-aligned, no dashes). Verified via pdftotext.

Co-Authored-By: Claude Opus 4.8 (1M context) <noreply@anthropic.com>
</commit_message>
<xml_diff>
--- a/career-kb/templates/CV_Template_Rezi_DE_Dec2025.docx
+++ b/career-kb/templates/CV_Template_Rezi_DE_Dec2025.docx
@@ -284,7 +284,7 @@
           <w:shd w:fill="auto" w:val="clear"/>
           <w:vertAlign w:val="baseline"/>
         </w:rPr>
-        <w:t>PROFIL</w:t>
+        <w:t>PROFESSIONAL SUMMARY</w:t>
       </w:r>
     </w:p>
     <w:p>
@@ -302,7 +302,7 @@
           <w:sz w:val="15"/>
           <w:szCs w:val="15"/>
         </w:rPr>
-        <w:t>Leidenschaft für den Aufbau moderner Software mit Fokus auf Architektur und angewandte KI. Erfahrene Entwicklerin mit Schwerpunkt auf sauberem, wartbarem Code und messbaren Ergebnissen. Auf der Suche nach einer Rolle mit Verantwortung für Architektur und technische Umsetzung.</w:t>
+        <w:t>Leidenschaft für den Aufbau inspirierender Unternehmen durch branchenführende Technik, Design und Umsetzung. Erfahrene Führungskraft der Frühphase mit einem wirtschaftswissenschaftlichen Abschluss der University of Wisconsin - Madison. Ich suche eine Position als globaler Startup-Berater.</w:t>
       </w:r>
     </w:p>
     <w:p>
@@ -361,7 +361,7 @@
           <w:shd w:fill="auto" w:val="clear"/>
           <w:vertAlign w:val="baseline"/>
         </w:rPr>
-        <w:t>KENNTNISSE</w:t>
+        <w:t>SKILLS</w:t>
       </w:r>
     </w:p>
     <w:p>
@@ -379,7 +379,7 @@
           <w:sz w:val="15"/>
           <w:szCs w:val="15"/>
         </w:rPr>
-        <w:t>Backend: PHP, Laravel, Symfony, REST-APIs, PostgreSQL, MySQL</w:t>
+        <w:t>Führung: Präsentation, Fundraising, Produktentwicklung, Kommunikation, Partnerschaften, internationales Marketing</w:t>
       </w:r>
     </w:p>
     <w:p>
@@ -407,7 +407,7 @@
           <w:sz w:val="15"/>
           <w:szCs w:val="15"/>
         </w:rPr>
-        <w:t>Frontend: TypeScript, JavaScript, Vue.js, Alpine.js, Tailwind CSS, HTML5, CSS3</w:t>
+        <w:t>Frontend: HTML, CSS, Bootstrap, Webflow | Design: Photoshop, Illustrator, Sketch</w:t>
       </w:r>
     </w:p>
     <w:p>
@@ -435,7 +435,7 @@
           <w:sz w:val="15"/>
           <w:szCs w:val="15"/>
         </w:rPr>
-        <w:t>Schwerpunkte: Softwarearchitektur, KI-Integration, DevOps, Requirements Engineering</w:t>
+        <w:t>Interessengebiete: Frühphasen-Fundraising, globales Unternehmertum, Webdesign, Wachstum</w:t>
       </w:r>
     </w:p>
     <w:p>
@@ -494,7 +494,7 @@
           <w:shd w:fill="auto" w:val="clear"/>
           <w:vertAlign w:val="baseline"/>
         </w:rPr>
-        <w:t>BERUFSERFAHRUNG</w:t>
+        <w:t>EXPERIENCE</w:t>
       </w:r>
     </w:p>
     <w:p>
@@ -537,7 +537,7 @@
           <w:sz w:val="15"/>
           <w:szCs w:val="15"/>
         </w:rPr>
-        <w:t>Beispiel GmbH</w:t>
+        <w:t>Rezi</w:t>
       </w:r>
       <w:r>
         <w:rPr/>
@@ -549,7 +549,7 @@
           <w:sz w:val="15"/>
           <w:szCs w:val="15"/>
         </w:rPr>
-        <w:t>08.2015 - heute, Musterstadt, Deutschland</w:t>
+        <w:t>08.2015 - heute, Seoul, Südkorea</w:t>
       </w:r>
     </w:p>
     <w:p>
@@ -572,7 +572,7 @@
           <w:sz w:val="15"/>
           <w:szCs w:val="15"/>
         </w:rPr>
-        <w:t>Aufbau und Weiterentwicklung einer modernen Webanwendung mit PHP/Laravel und TypeScript.</w:t>
+        <w:t>Rezi aufgebaut - die weltweit beliebteste Bewerbungssoftware, der über 4.124.000 Nutzer vertrauen.</w:t>
       </w:r>
     </w:p>
     <w:p>
@@ -595,7 +595,7 @@
           <w:sz w:val="15"/>
           <w:szCs w:val="15"/>
         </w:rPr>
-        <w:t>Konzeption der Softwarearchitektur eines Greenfield-Projekts; Backend, Frontend und Datenmodell von Grund auf gestaltet.</w:t>
+        <w:t>Rezi mit 22 Jahren gegründet. Mit 23 erfolgreich nach Südkorea expandiert und zum führenden Anbieter für englische Bewerbungen ausgebaut - das meistausgezeichnete globale Startup Südkoreas, mit über 650.000 $ an Investitionen, Fördermitteln und Auszeichnungen.</w:t>
       </w:r>
     </w:p>
     <w:p>
@@ -618,7 +618,7 @@
           <w:sz w:val="15"/>
           <w:szCs w:val="15"/>
         </w:rPr>
-        <w:t>Integration von KI-Werkzeugen in den täglichen Entwicklungs-Workflow für Code-Analyse und Automatisierung.</w:t>
+        <w:t>Gemeinsam mit dem Entwicklungsteam skalierbare Partnerstrategien konzipiert, etwa den Zugang über Einlösecodes, was zu über 50.000 neuen Nutzern in einem Monat ohne Marketingbudget führte.</w:t>
       </w:r>
     </w:p>
     <w:p>
@@ -641,7 +641,7 @@
           <w:sz w:val="15"/>
           <w:szCs w:val="15"/>
         </w:rPr>
-        <w:t>Aufbau und Pflege der CI/CD-Pipelines sowie Containerisierung der Anwendung mit Docker.</w:t>
+        <w:t>Verantwortlich für die Entwicklung neuer Geschäftsmodelle als Reaktion auf Marktbedingungen und Chancen, woraus drei neue Kernbereiche entstanden: E-Learning, globales Recruiting und Datenvertrieb.</w:t>
       </w:r>
     </w:p>
     <w:p>
@@ -664,7 +664,7 @@
           <w:sz w:val="15"/>
           <w:szCs w:val="15"/>
         </w:rPr>
-        <w:t>Testautomatisierung mit PHPUnit und Codeception nach dem BDD-Ansatz.</w:t>
+        <w:t>16 Vollzeitmitarbeitende; 4.123.390 Nutzer; 650.000 $ Gesamtinvestition; 38.000.000 $ Bewertung.</w:t>
       </w:r>
     </w:p>
     <w:p>
@@ -717,7 +717,7 @@
           <w:sz w:val="15"/>
           <w:szCs w:val="15"/>
         </w:rPr>
-        <w:t>Beispiel AG</w:t>
+        <w:t>Kaplan</w:t>
       </w:r>
       <w:r>
         <w:rPr/>
@@ -729,7 +729,7 @@
           <w:sz w:val="15"/>
           <w:szCs w:val="15"/>
         </w:rPr>
-        <w:t xml:space="preserve">05.2015 - 11.2015, Musterstadt </w:t>
+        <w:t xml:space="preserve">05.2015 - 11.2015, La Crosse, WI </w:t>
       </w:r>
     </w:p>
     <w:p>
@@ -752,7 +752,7 @@
           <w:sz w:val="15"/>
           <w:szCs w:val="15"/>
         </w:rPr>
-        <w:t>Eigenständige Planung, Umsetzung und Wartung von Webanwendungen für verschiedene Kunden.</w:t>
+        <w:t>Relaunch der Website kaplancleantech.com mit Expression Engine als CMS in Zusammenarbeit mit Marketing- und Vertriebsteams. Drei Landingpage-Varianten mittels HTML, A/B-Testing und Kundenfeedback optimiert, um mehr Leads für den Vertrieb zu erzielen.</w:t>
       </w:r>
     </w:p>
     <w:p>
@@ -775,7 +775,7 @@
           <w:sz w:val="15"/>
           <w:szCs w:val="15"/>
         </w:rPr>
-        <w:t>Entwurf und Umsetzung von Backend- und Frontend-Funktionalitäten sowie der zugrunde liegenden Datenbanken.</w:t>
+        <w:t>Leitung der Entwicklung von SEO-Strategien und Überwachung der Kampagnen mit MOZ Analytics bei einem Budget von 500k. Performance durch Website-Analysen und neue Keyword-Recherche gesichert. Analyse- und Ranking-Berichte für das Management erstellt.</w:t>
       </w:r>
     </w:p>
     <w:p>
@@ -798,7 +798,7 @@
           <w:sz w:val="15"/>
           <w:szCs w:val="15"/>
         </w:rPr>
-        <w:t>Testautomatisierung mit PHPUnit und Dokumentation mit PHPDoc; direkte Kundenkommunikation.</w:t>
+        <w:t>Google-Analytics-Kampagnen umgesetzt, um die Wirksamkeit von fünf E-Mail-Remarketing-Initiativen mit Salesforce zu maximieren. Salesforce Object Query Language, C und Python zur gezielten Datensuche eingesetzt.</w:t>
       </w:r>
     </w:p>
     <w:p>
@@ -829,7 +829,7 @@
           <w:sz w:val="18"/>
           <w:szCs w:val="18"/>
         </w:rPr>
-        <w:t>Webentwicklung / Koordination</w:t>
+        <w:t>Marketing-Analyst</w:t>
       </w:r>
     </w:p>
     <w:p>
@@ -851,7 +851,7 @@
           <w:sz w:val="15"/>
           <w:szCs w:val="15"/>
         </w:rPr>
-        <w:t>Beispiel AG</w:t>
+        <w:t>Kaplan</w:t>
       </w:r>
       <w:r>
         <w:rPr/>
@@ -863,7 +863,7 @@
           <w:sz w:val="15"/>
           <w:szCs w:val="15"/>
         </w:rPr>
-        <w:t xml:space="preserve">11.2014 - 05.2015, Musterstadt </w:t>
+        <w:t xml:space="preserve">11.2014 - 05.2015, La Crosse, WI </w:t>
       </w:r>
     </w:p>
     <w:p>
@@ -886,7 +886,7 @@
           <w:sz w:val="15"/>
           <w:szCs w:val="15"/>
         </w:rPr>
-        <w:t>Weiterentwicklung einer historisch gewachsenen Codebasis in einem proprietären Framework.</w:t>
+        <w:t>Tableau-Dashboards implementiert, um sechs Marketing-Kennzahlen zu verfolgen. Daten für Berichte an die Führungsebene aufbereitet. Mit Marketing-Spezialisten zusammengearbeitet, um Strategien zur Maximierung des ROI zu verbessern, etwa durch Facebook-Retargeting.</w:t>
       </w:r>
     </w:p>
     <w:p>
@@ -909,7 +909,7 @@
           <w:sz w:val="15"/>
           <w:szCs w:val="15"/>
         </w:rPr>
-        <w:t>Analyse komplexer Legacy-Abhängigkeiten und Dokumentation technischer Prozesse.</w:t>
+        <w:t>Über 100 Kundenrückmeldungen mit SurveyMonkey erhoben, um Analysen durchzuführen, Markttrends zu erkennen und den NPS zu berechnen. Kundenfeedback und Optimierungssoftware genutzt, um dem Management Website-Verbesserungen vorzuschlagen.</w:t>
       </w:r>
     </w:p>
     <w:p>
@@ -932,7 +932,7 @@
           <w:sz w:val="15"/>
           <w:szCs w:val="15"/>
         </w:rPr>
-        <w:t>Koordination eines zehnköpfigen Teams und Abstimmung technischer wie organisatorischer Aufgaben.</w:t>
+        <w:t>Mobile PPC-Strategien mit Google AdWords Editor und Marin verantwortet und Marketing-Spezialisten Best Practices vermittelt.</w:t>
       </w:r>
     </w:p>
     <w:p>
@@ -985,7 +985,7 @@
           <w:sz w:val="15"/>
           <w:szCs w:val="15"/>
         </w:rPr>
-        <w:t>Beispiel e.V.</w:t>
+        <w:t>Wisconsin Public Television</w:t>
       </w:r>
       <w:r>
         <w:rPr/>
@@ -997,7 +997,7 @@
           <w:sz w:val="15"/>
           <w:szCs w:val="15"/>
         </w:rPr>
-        <w:t>06.2012 - 09.2012, Musterstadt</w:t>
+        <w:t>06.2012 - 09.2012, Madison, WI</w:t>
       </w:r>
     </w:p>
     <w:p>
@@ -1020,7 +1020,7 @@
           <w:sz w:val="15"/>
           <w:szCs w:val="15"/>
         </w:rPr>
-        <w:t>Mitarbeit an der Konzeption und Umsetzung einer Website inklusive SEO-Maßnahmen.</w:t>
+        <w:t>Analytics und Marketing-Pixel integriert, um das Verhalten bei der Einführung von Aktionen zu verfolgen, was über 235k $ Umsatz brachte.</w:t>
       </w:r>
     </w:p>
     <w:p>
@@ -1079,7 +1079,7 @@
           <w:shd w:fill="auto" w:val="clear"/>
           <w:vertAlign w:val="baseline"/>
         </w:rPr>
-        <w:t>PROJEKTE</w:t>
+        <w:t>PROJECT</w:t>
       </w:r>
     </w:p>
     <w:p>
@@ -1100,7 +1100,7 @@
           <w:sz w:val="18"/>
           <w:szCs w:val="18"/>
         </w:rPr>
-        <w:t>Open-Source-Projekt</w:t>
+        <w:t>Startup-Architekt (Frühphase)</w:t>
       </w:r>
     </w:p>
     <w:p>
@@ -1118,7 +1118,7 @@
           <w:sz w:val="15"/>
           <w:szCs w:val="15"/>
         </w:rPr>
-        <w:t>Persönliches Projekt • &lt;nil&gt;</w:t>
+        <w:t>Unabhängiger Startup-Berater • &lt;nil&gt;</w:t>
       </w:r>
     </w:p>
     <w:p>
@@ -1141,7 +1141,7 @@
           <w:sz w:val="15"/>
           <w:szCs w:val="15"/>
         </w:rPr>
-        <w:t>Veröffentlichung eines quelloffenen Laravel-Pakets; Fokus auf sauberes, testbares Design.</w:t>
+        <w:t>Mit drei internationalen Gründern zusammengearbeitet, um durchdachte Minimum Viable Products über No-Code- und "Ship-First"-Methoden auf den Markt zu bringen.</w:t>
       </w:r>
     </w:p>
     <w:p>
@@ -1200,7 +1200,7 @@
           <w:shd w:fill="auto" w:val="clear"/>
           <w:vertAlign w:val="baseline"/>
         </w:rPr>
-        <w:t>AUSBILDUNG</w:t>
+        <w:t>EDUCATION</w:t>
       </w:r>
     </w:p>
     <w:p>
@@ -1221,25 +1221,25 @@
           <w:sz w:val="18"/>
           <w:szCs w:val="18"/>
         </w:rPr>
-        <w:t>Fachinformatikerin für Anwendungsentwicklung</w:t>
-      </w:r>
-    </w:p>
-    <w:p>
-      <w:pPr>
-        <w:pStyle w:val="normal1"/>
-        <w:spacing w:lineRule="auto" w:line="268" w:before="0" w:after="0"/>
-        <w:rPr>
-          <w:sz w:val="15"/>
-          <w:szCs w:val="15"/>
-        </w:rPr>
-      </w:pPr>
-      <w:r>
-        <w:rPr>
-          <w:color w:val="2E3D50"/>
-          <w:sz w:val="15"/>
-          <w:szCs w:val="15"/>
-        </w:rPr>
-        <w:t>Beispiel-Bildungsträger, Musterstadt  •  08.2019 - 06.2021</w:t>
+        <w:t>Bachelor of Science in Volkswirtschaftslehre mit Schwerpunkt Mathematik</w:t>
+      </w:r>
+    </w:p>
+    <w:p>
+      <w:pPr>
+        <w:pStyle w:val="normal1"/>
+        <w:spacing w:lineRule="auto" w:line="268" w:before="0" w:after="0"/>
+        <w:rPr>
+          <w:sz w:val="15"/>
+          <w:szCs w:val="15"/>
+        </w:rPr>
+      </w:pPr>
+      <w:r>
+        <w:rPr>
+          <w:color w:val="2E3D50"/>
+          <w:sz w:val="15"/>
+          <w:szCs w:val="15"/>
+        </w:rPr>
+        <w:t>University of Wisconsin - Madison  • Powers-Knapp-Stipendiat •  2014</w:t>
       </w:r>
     </w:p>
     <w:sectPr>

</xml_diff>

<commit_message>
German template: German section headers (target German ATS)
Per user: the German CV targets German ATS (which recognize BERUFSERFAHRUNG/
AUSBILDUNG/KENNTNISSE), not English-only scanners. So the DE template uses
German section headers matching the DE content JSONs' headings. Kept: faithful
German prose, MM.YYYY dates, German name/contact, no injected PHPUnit/PHPDoc,
same structure as the ATS-fixed EN base. DE content JSONs unchanged (already
German headings).

Co-Authored-By: Claude Opus 4.8 (1M context) <noreply@anthropic.com>
</commit_message>
<xml_diff>
--- a/career-kb/templates/CV_Template_Rezi_DE_Dec2025.docx
+++ b/career-kb/templates/CV_Template_Rezi_DE_Dec2025.docx
@@ -284,7 +284,7 @@
           <w:shd w:fill="auto" w:val="clear"/>
           <w:vertAlign w:val="baseline"/>
         </w:rPr>
-        <w:t>PROFESSIONAL SUMMARY</w:t>
+        <w:t>PROFIL</w:t>
       </w:r>
     </w:p>
     <w:p>
@@ -361,7 +361,7 @@
           <w:shd w:fill="auto" w:val="clear"/>
           <w:vertAlign w:val="baseline"/>
         </w:rPr>
-        <w:t>SKILLS</w:t>
+        <w:t>KENNTNISSE</w:t>
       </w:r>
     </w:p>
     <w:p>
@@ -494,7 +494,7 @@
           <w:shd w:fill="auto" w:val="clear"/>
           <w:vertAlign w:val="baseline"/>
         </w:rPr>
-        <w:t>EXPERIENCE</w:t>
+        <w:t>BERUFSERFAHRUNG</w:t>
       </w:r>
     </w:p>
     <w:p>
@@ -1079,7 +1079,7 @@
           <w:shd w:fill="auto" w:val="clear"/>
           <w:vertAlign w:val="baseline"/>
         </w:rPr>
-        <w:t>PROJECT</w:t>
+        <w:t>PROJEKTE</w:t>
       </w:r>
     </w:p>
     <w:p>
@@ -1200,7 +1200,7 @@
           <w:shd w:fill="auto" w:val="clear"/>
           <w:vertAlign w:val="baseline"/>
         </w:rPr>
-        <w:t>EDUCATION</w:t>
+        <w:t>AUSBILDUNG</w:t>
       </w:r>
     </w:p>
     <w:p>

</xml_diff>

<commit_message>
Lead template experience entries with timespan (both EN + DE)
Raw templates hid the experience dates behind an off-page right tab (20000
twips), so scans reported "timespans missing". tools/apply_timespan_layout.py
rewrites each experience placeholder to "Date | Title" (timespan in front) with
a left-aligned "Company · Location" line, matching build_cv's generated layout.
EN keeps English month/year, DE uses MM.YYYY. build_cv still builds correctly
(prototypes are found by style, not the tab).

Co-Authored-By: Claude Opus 4.8 (1M context) <noreply@anthropic.com>
</commit_message>
<xml_diff>
--- a/career-kb/templates/CV_Template_Rezi_DE_Dec2025.docx
+++ b/career-kb/templates/CV_Template_Rezi_DE_Dec2025.docx
@@ -515,7 +515,7 @@
           <w:sz w:val="18"/>
           <w:szCs w:val="18"/>
         </w:rPr>
-        <w:t>Geschäftsführer &amp; Gründer</w:t>
+        <w:t>08.2015 - heute | Geschäftsführer &amp; Gründer</w:t>
       </w:r>
     </w:p>
     <w:p>
@@ -541,15 +541,14 @@
       </w:r>
       <w:r>
         <w:rPr/>
-        <w:tab/>
-      </w:r>
-      <w:r>
-        <w:rPr>
-          <w:color w:val="2E3D50"/>
-          <w:sz w:val="15"/>
-          <w:szCs w:val="15"/>
-        </w:rPr>
-        <w:t>08.2015 - heute, Seoul, Südkorea</w:t>
+      </w:r>
+      <w:r>
+        <w:rPr>
+          <w:color w:val="2E3D50"/>
+          <w:sz w:val="15"/>
+          <w:szCs w:val="15"/>
+        </w:rPr>
+        <w:t> · Seoul, Südkorea</w:t>
       </w:r>
     </w:p>
     <w:p>
@@ -695,7 +694,7 @@
           <w:sz w:val="18"/>
           <w:szCs w:val="18"/>
         </w:rPr>
-        <w:t>Webentwickler</w:t>
+        <w:t>05.2015 - 11.2015 | Webentwickler</w:t>
       </w:r>
     </w:p>
     <w:p>
@@ -721,15 +720,14 @@
       </w:r>
       <w:r>
         <w:rPr/>
-        <w:tab/>
-      </w:r>
-      <w:r>
-        <w:rPr>
-          <w:color w:val="2E3D50"/>
-          <w:sz w:val="15"/>
-          <w:szCs w:val="15"/>
-        </w:rPr>
-        <w:t xml:space="preserve">05.2015 - 11.2015, La Crosse, WI </w:t>
+      </w:r>
+      <w:r>
+        <w:rPr>
+          <w:color w:val="2E3D50"/>
+          <w:sz w:val="15"/>
+          <w:szCs w:val="15"/>
+        </w:rPr>
+        <w:t xml:space="preserve"> · La Crosse, WI</w:t>
       </w:r>
     </w:p>
     <w:p>
@@ -829,7 +827,7 @@
           <w:sz w:val="18"/>
           <w:szCs w:val="18"/>
         </w:rPr>
-        <w:t>Marketing-Analyst</w:t>
+        <w:t>11.2014 - 05.2015 | Marketing-Analyst</w:t>
       </w:r>
     </w:p>
     <w:p>
@@ -855,15 +853,14 @@
       </w:r>
       <w:r>
         <w:rPr/>
-        <w:tab/>
-      </w:r>
-      <w:r>
-        <w:rPr>
-          <w:color w:val="2E3D50"/>
-          <w:sz w:val="15"/>
-          <w:szCs w:val="15"/>
-        </w:rPr>
-        <w:t xml:space="preserve">11.2014 - 05.2015, La Crosse, WI </w:t>
+      </w:r>
+      <w:r>
+        <w:rPr>
+          <w:color w:val="2E3D50"/>
+          <w:sz w:val="15"/>
+          <w:szCs w:val="15"/>
+        </w:rPr>
+        <w:t xml:space="preserve"> · La Crosse, WI</w:t>
       </w:r>
     </w:p>
     <w:p>
@@ -963,7 +960,7 @@
           <w:sz w:val="18"/>
           <w:szCs w:val="18"/>
         </w:rPr>
-        <w:t>Praktikant Webentwicklung</w:t>
+        <w:t>06.2012 - 09.2012 | Praktikant Webentwicklung</w:t>
       </w:r>
     </w:p>
     <w:p>
@@ -989,15 +986,14 @@
       </w:r>
       <w:r>
         <w:rPr/>
-        <w:tab/>
-      </w:r>
-      <w:r>
-        <w:rPr>
-          <w:color w:val="2E3D50"/>
-          <w:sz w:val="15"/>
-          <w:szCs w:val="15"/>
-        </w:rPr>
-        <w:t>06.2012 - 09.2012, Madison, WI</w:t>
+      </w:r>
+      <w:r>
+        <w:rPr>
+          <w:color w:val="2E3D50"/>
+          <w:sz w:val="15"/>
+          <w:szCs w:val="15"/>
+        </w:rPr>
+        <w:t> · Madison, WI</w:t>
       </w:r>
     </w:p>
     <w:p>

</xml_diff>

<commit_message>
Align template placeholders: skills as bold-bulleted, projects with timespan
- Both templates: skills lines -> bold-labelled bullets with uniform spacing
  (spacers removed); project entry gets a timespan in front of its title.
  Done by tools/align_template_skills_projects.py.
- build_cv find_prototypes now anchors the experience prototypes on the
  EXPERIENCE/BERUFSERFAHRUNG heading, so skills-as-bullets (which sit above
  experience) can't be mistaken for the job title/company/first bullet.
  Verified build_cv still generates correctly from the transformed templates.

Co-Authored-By: Claude Opus 4.8 (1M context) <noreply@anthropic.com>
</commit_message>
<xml_diff>
--- a/career-kb/templates/CV_Template_Rezi_DE_Dec2025.docx
+++ b/career-kb/templates/CV_Template_Rezi_DE_Dec2025.docx
@@ -367,75 +367,97 @@
     <w:p>
       <w:pPr>
         <w:pStyle w:val="normal1"/>
-        <w:spacing w:lineRule="auto" w:line="268" w:before="0" w:after="0"/>
-        <w:rPr>
-          <w:sz w:val="2"/>
-          <w:szCs w:val="2"/>
-        </w:rPr>
-      </w:pPr>
-      <w:r>
-        <w:rPr>
-          <w:color w:val="2E3D50"/>
-          <w:sz w:val="15"/>
-          <w:szCs w:val="15"/>
-        </w:rPr>
-        <w:t>Führung: Präsentation, Fundraising, Produktentwicklung, Kommunikation, Partnerschaften, internationales Marketing</w:t>
-      </w:r>
-    </w:p>
-    <w:p>
-      <w:pPr>
-        <w:pStyle w:val="normal1"/>
-        <w:spacing w:lineRule="auto" w:line="158" w:before="0" w:after="0"/>
-        <w:rPr/>
-      </w:pPr>
-      <w:r>
-        <w:rPr/>
-      </w:r>
-    </w:p>
-    <w:p>
-      <w:pPr>
-        <w:pStyle w:val="normal1"/>
-        <w:spacing w:lineRule="auto" w:line="268" w:before="0" w:after="0"/>
-        <w:rPr>
-          <w:sz w:val="2"/>
-          <w:szCs w:val="2"/>
-        </w:rPr>
-      </w:pPr>
-      <w:r>
-        <w:rPr>
-          <w:color w:val="2E3D50"/>
-          <w:sz w:val="15"/>
-          <w:szCs w:val="15"/>
-        </w:rPr>
-        <w:t>Frontend: HTML, CSS, Bootstrap, Webflow | Design: Photoshop, Illustrator, Sketch</w:t>
-      </w:r>
-    </w:p>
-    <w:p>
-      <w:pPr>
-        <w:pStyle w:val="normal1"/>
-        <w:spacing w:lineRule="auto" w:line="158" w:before="0" w:after="0"/>
-        <w:rPr/>
-      </w:pPr>
-      <w:r>
-        <w:rPr/>
-      </w:r>
-    </w:p>
-    <w:p>
-      <w:pPr>
-        <w:pStyle w:val="normal1"/>
-        <w:spacing w:lineRule="auto" w:line="268" w:before="0" w:after="0"/>
-        <w:rPr>
-          <w:sz w:val="2"/>
-          <w:szCs w:val="2"/>
-        </w:rPr>
-      </w:pPr>
-      <w:r>
-        <w:rPr>
-          <w:color w:val="2E3D50"/>
-          <w:sz w:val="15"/>
-          <w:szCs w:val="15"/>
-        </w:rPr>
-        <w:t>Interessengebiete: Frühphasen-Fundraising, globales Unternehmertum, Webdesign, Wachstum</w:t>
+        <w:numPr>
+          <w:ilvl w:val="0"/>
+          <w:numId w:val="1"/>
+        </w:numPr>
+        <w:spacing w:lineRule="auto" w:line="268" w:before="0" w:after="0"/>
+        <w:ind w:hanging="90" w:left="111"/>
+        <w:rPr>
+          <w:sz w:val="15"/>
+          <w:szCs w:val="15"/>
+        </w:rPr>
+      </w:pPr>
+      <w:r>
+        <w:rPr>
+          <w:color w:val="2E3D50"/>
+          <w:sz w:val="15"/>
+          <w:szCs w:val="15"/>
+          <w:b/>
+        </w:rPr>
+        <w:t xml:space="preserve">Führung:</w:t>
+      </w:r>
+      <w:r>
+        <w:rPr>
+          <w:color w:val="2E3D50"/>
+          <w:sz w:val="15"/>
+          <w:szCs w:val="15"/>
+        </w:rPr>
+        <w:t xml:space="preserve"> Präsentation, Fundraising, Produktentwicklung, Kommunikation, Partnerschaften, internationales Marketing</w:t>
+      </w:r>
+    </w:p>
+    <w:p>
+      <w:pPr>
+        <w:pStyle w:val="normal1"/>
+        <w:numPr>
+          <w:ilvl w:val="0"/>
+          <w:numId w:val="1"/>
+        </w:numPr>
+        <w:spacing w:lineRule="auto" w:line="268" w:before="0" w:after="0"/>
+        <w:ind w:hanging="90" w:left="111"/>
+        <w:rPr>
+          <w:sz w:val="15"/>
+          <w:szCs w:val="15"/>
+        </w:rPr>
+      </w:pPr>
+      <w:r>
+        <w:rPr>
+          <w:color w:val="2E3D50"/>
+          <w:sz w:val="15"/>
+          <w:szCs w:val="15"/>
+          <w:b/>
+        </w:rPr>
+        <w:t xml:space="preserve">Frontend:</w:t>
+      </w:r>
+      <w:r>
+        <w:rPr>
+          <w:color w:val="2E3D50"/>
+          <w:sz w:val="15"/>
+          <w:szCs w:val="15"/>
+        </w:rPr>
+        <w:t xml:space="preserve"> HTML, CSS, Bootstrap, Webflow | Design: Photoshop, Illustrator, Sketch</w:t>
+      </w:r>
+    </w:p>
+    <w:p>
+      <w:pPr>
+        <w:pStyle w:val="normal1"/>
+        <w:numPr>
+          <w:ilvl w:val="0"/>
+          <w:numId w:val="1"/>
+        </w:numPr>
+        <w:spacing w:lineRule="auto" w:line="268" w:before="0" w:after="0"/>
+        <w:ind w:hanging="90" w:left="111"/>
+        <w:rPr>
+          <w:sz w:val="15"/>
+          <w:szCs w:val="15"/>
+        </w:rPr>
+      </w:pPr>
+      <w:r>
+        <w:rPr>
+          <w:color w:val="2E3D50"/>
+          <w:sz w:val="15"/>
+          <w:szCs w:val="15"/>
+          <w:b/>
+        </w:rPr>
+        <w:t xml:space="preserve">Interessengebiete:</w:t>
+      </w:r>
+      <w:r>
+        <w:rPr>
+          <w:color w:val="2E3D50"/>
+          <w:sz w:val="15"/>
+          <w:szCs w:val="15"/>
+        </w:rPr>
+        <w:t xml:space="preserve"> Frühphasen-Fundraising, globales Unternehmertum, Webdesign, Wachstum</w:t>
       </w:r>
     </w:p>
     <w:p>
@@ -1096,7 +1118,7 @@
           <w:sz w:val="18"/>
           <w:szCs w:val="18"/>
         </w:rPr>
-        <w:t>Startup-Architekt (Frühphase)</w:t>
+        <w:t>2024 - 2025 | Startup-Architekt (Frühphase)</w:t>
       </w:r>
     </w:p>
     <w:p>

</xml_diff>